<commit_message>
Feature 011 — Simplified Template Syntax and DOCX Compatibility - WiP
</commit_message>
<xml_diff>
--- a/Samples/orders-report.template.docx
+++ b/Samples/orders-report.template.docx
@@ -370,7 +370,7 @@
           </w:tcPr>
           <w:p>
             <w:r>
-              <w:t>{EndFor}</w:t>
+              <w:t>{/For}</w:t>
             </w:r>
           </w:p>
         </w:tc>
@@ -427,7 +427,7 @@
     </w:p>
     <w:p>
       <w:r>
-        <w:t>{EndFor}</w:t>
+        <w:t>{/For}</w:t>
       </w:r>
     </w:p>
     <w:p>

</xml_diff>